<commit_message>
[Gitesh] update : the doc file of Execise 1
</commit_message>
<xml_diff>
--- a/WEEK6/GIT/Exercise1/Git_Lab_Report_Final_Completed.docx
+++ b/WEEK6/GIT/Exercise1/Git_Lab_Report_Final_Completed.docx
@@ -344,10 +344,7 @@
       </w:r>
       <w:r>
         <w:br/>
-        <w:t>c</w:t>
-      </w:r>
-      <w:r>
-        <w:t>d GitDemo</w:t>
+        <w:t>cd GitDemo</w:t>
       </w:r>
       <w:r>
         <w:br/>
@@ -884,18 +881,7 @@
         <w:pStyle w:val="Heading2"/>
       </w:pPr>
       <w:r>
-        <w:t xml:space="preserve">Step </w:t>
-      </w:r>
-      <w:proofErr w:type="gramStart"/>
-      <w:r>
-        <w:t xml:space="preserve">13 </w:t>
-      </w:r>
-      <w:r>
-        <w:t>:</w:t>
-      </w:r>
-      <w:proofErr w:type="gramEnd"/>
-      <w:r>
-        <w:t xml:space="preserve"> Add and Verify Remote</w:t>
+        <w:t>Step 13 : Add and Verify Remote</w:t>
       </w:r>
     </w:p>
     <w:p>
@@ -1005,13 +991,7 @@
       </w:pPr>
       <w:r>
         <w:lastRenderedPageBreak/>
-        <w:t xml:space="preserve">Step </w:t>
-      </w:r>
-      <w:r>
-        <w:t>14</w:t>
-      </w:r>
-      <w:r>
-        <w:t>: Pull and Push Repository</w:t>
+        <w:t>Step 14: Pull and Push Repository</w:t>
       </w:r>
     </w:p>
     <w:p>
@@ -1123,45 +1103,10 @@
     </w:p>
     <w:p>
       <w:r>
-        <w:t xml:space="preserve">Git was </w:t>
-      </w:r>
-      <w:r>
-        <w:t>configured successfully. A local repository was created, a text file was committed, and the project was prepared for synchronization with the remote GitLab repository.</w:t>
+        <w:t>Git was configured successfully. A local repository was created, a text file was committed, and the project was prepared for synchronization with the remote GitLab repository.</w:t>
       </w:r>
     </w:p>
     <w:p>
-      <w:r>
-        <w:br w:type="page"/>
-      </w:r>
-    </w:p>
-    <w:p>
-      <w:pPr>
-        <w:pStyle w:val="Heading1"/>
-      </w:pPr>
-      <w:r>
-        <w:lastRenderedPageBreak/>
-        <w:t>Additional Notes</w:t>
-      </w:r>
-    </w:p>
-    <w:p>
-      <w:r>
-        <w:t xml:space="preserve">Paste the remaining screenshots in the placeholders provided for the </w:t>
-      </w:r>
-      <w:r>
-        <w:t>following steps:</w:t>
-      </w:r>
-      <w:r>
-        <w:br/>
-        <w:t>• Verify Remote Repository (git remote -v)</w:t>
-      </w:r>
-      <w:r>
-        <w:br/>
-        <w:t>• Pull Remote Repository (git pull origin main --allow-unrelated-histories)</w:t>
-      </w:r>
-      <w:r>
-        <w:br/>
-        <w:t>• Push Repository (git push -u origin master)</w:t>
-      </w:r>
       <w:r>
         <w:br/>
       </w:r>
@@ -1664,11 +1609,6 @@
     <w:lsdException w:name="Book Title" w:uiPriority="33" w:qFormat="1"/>
     <w:lsdException w:name="Bibliography" w:semiHidden="1" w:uiPriority="37" w:unhideWhenUsed="1"/>
     <w:lsdException w:name="TOC Heading" w:semiHidden="1" w:uiPriority="39" w:unhideWhenUsed="1" w:qFormat="1"/>
-    <w:lsdException w:name="Plain Table 5" w:semiHidden="1" w:unhideWhenUsed="1"/>
-    <w:lsdException w:name="Grid Table Light" w:semiHidden="1" w:unhideWhenUsed="1"/>
-    <w:lsdException w:name="Grid Table 1 Light" w:semiHidden="1" w:unhideWhenUsed="1"/>
-    <w:lsdException w:name="Grid Table 2" w:semiHidden="1" w:unhideWhenUsed="1"/>
-    <w:lsdException w:name="Grid Table 3" w:semiHidden="1" w:unhideWhenUsed="1"/>
     <w:lsdException w:name="Grid Table 4" w:uiPriority="49"/>
     <w:lsdException w:name="Grid Table 5 Dark" w:uiPriority="50"/>
     <w:lsdException w:name="Grid Table 6 Colorful" w:uiPriority="51"/>

</xml_diff>